<commit_message>
retirado 5 centavos do preço
</commit_message>
<xml_diff>
--- a/dados/FONTE 120 BOB.docx
+++ b/dados/FONTE 120 BOB.docx
@@ -9,7 +9,329 @@
     </w:p>
     <w:p>
       <w:r>
-        <w:t>URL: https://produto.mercadolivre.com.br/MLB-3348316634-fonte-carregador-automotivo-jfa-bob-storm-120a-bivolt-_JM</w:t>
+        <w:t>URL: https://produto.mercadolivre.com.br/MLB-4811938642-fonte-carregador-jfa-120a-bob-slim-bivolt-cor-preto-_JM</w:t>
+      </w:r>
+    </w:p>
+    <w:p>
+      <w:r>
+        <w:t>Nome: Fonte Carregador Jfa 120a Bob Slim Bivolt Cor Preto</w:t>
+      </w:r>
+    </w:p>
+    <w:p>
+      <w:r>
+        <w:t>Preço: 446.88</w:t>
+      </w:r>
+    </w:p>
+    <w:p>
+      <w:r>
+        <w:t>Preço Previsto: 446.89</w:t>
+      </w:r>
+    </w:p>
+    <w:p>
+      <w:r>
+        <w:t>Loja: ZARIPARTS1710</w:t>
+      </w:r>
+    </w:p>
+    <w:p>
+      <w:r>
+        <w:t>Tipo: Clássico</w:t>
+      </w:r>
+    </w:p>
+    <w:p>
+      <w:r>
+        <w:t>Lugar: Penha, Santa Catarina.</w:t>
+      </w:r>
+    </w:p>
+    <w:p>
+      <w:r>
+        <w:t>--------------------------------------------------------------------</w:t>
+      </w:r>
+    </w:p>
+    <w:p/>
+    <w:p>
+      <w:r>
+        <w:t>Modelo: FONTE 120 BOB</w:t>
+      </w:r>
+    </w:p>
+    <w:p>
+      <w:r>
+        <w:t>URL: https://www.shoppratico.com.br/MLB-2915788930-fonte-carregador-automotivo-jfa-bob-storm-120a-bivolt-_JM#position%3D1%26search_layout%3Dstack%26type%3Ditem%26tracking_id%3Deaeaf62b-93d9-491e-a369-dda72e3f48fd</w:t>
+      </w:r>
+    </w:p>
+    <w:p>
+      <w:r>
+        <w:t>Nome: fonte carregador automotivo jfa bob storm 120a bivolt</w:t>
+      </w:r>
+    </w:p>
+    <w:p>
+      <w:r>
+        <w:t>Preço: 419.85</w:t>
+      </w:r>
+    </w:p>
+    <w:p>
+      <w:r>
+        <w:t>Preço Previsto: 419.86</w:t>
+      </w:r>
+    </w:p>
+    <w:p>
+      <w:r>
+        <w:t>Loja: SHOPPRATICO</w:t>
+      </w:r>
+    </w:p>
+    <w:p>
+      <w:r>
+        <w:t xml:space="preserve">Tipo: </w:t>
+      </w:r>
+    </w:p>
+    <w:p>
+      <w:r>
+        <w:t>Lugar: Sorocaba, São Paulo.</w:t>
+      </w:r>
+    </w:p>
+    <w:p>
+      <w:r>
+        <w:t>--------------------------------------------------------------------</w:t>
+      </w:r>
+    </w:p>
+    <w:p/>
+    <w:p>
+      <w:r>
+        <w:t>Modelo: FONTE 120 BOB</w:t>
+      </w:r>
+    </w:p>
+    <w:p>
+      <w:r>
+        <w:t>URL: https://www.shoppratico.com.br/MLB-3266249701-fonte-carregador-automotivo-jfa-bob-storm-120a-bivolt-_JM#position%3D2%26search_layout%3Dstack%26type%3Ditem%26tracking_id%3Deaeaf62b-93d9-491e-a369-dda72e3f48fd</w:t>
+      </w:r>
+    </w:p>
+    <w:p>
+      <w:r>
+        <w:t>Nome: fonte carregador automotivo jfa bob storm 120a bivolt</w:t>
+      </w:r>
+    </w:p>
+    <w:p>
+      <w:r>
+        <w:t>Preço: 419.85</w:t>
+      </w:r>
+    </w:p>
+    <w:p>
+      <w:r>
+        <w:t>Preço Previsto: 419.86</w:t>
+      </w:r>
+    </w:p>
+    <w:p>
+      <w:r>
+        <w:t>Loja: SHOPPRATICO</w:t>
+      </w:r>
+    </w:p>
+    <w:p>
+      <w:r>
+        <w:t xml:space="preserve">Tipo: </w:t>
+      </w:r>
+    </w:p>
+    <w:p>
+      <w:r>
+        <w:t>Lugar: Sorocaba, São Paulo.</w:t>
+      </w:r>
+    </w:p>
+    <w:p>
+      <w:r>
+        <w:t>--------------------------------------------------------------------</w:t>
+      </w:r>
+    </w:p>
+    <w:p/>
+    <w:p>
+      <w:r>
+        <w:t>Modelo: FONTE 120 BOB</w:t>
+      </w:r>
+    </w:p>
+    <w:p>
+      <w:r>
+        <w:t>URL: https://produto.mercadolivre.com.br/MLB-2773109259-fonte-carregador-jfa-120a-bob-slim-bivolt-_JM</w:t>
+      </w:r>
+    </w:p>
+    <w:p>
+      <w:r>
+        <w:t>Nome: Fonte Carregador Jfa 120a Bob Slim Bivolt</w:t>
+      </w:r>
+    </w:p>
+    <w:p>
+      <w:r>
+        <w:t>Preço: 446.88</w:t>
+      </w:r>
+    </w:p>
+    <w:p>
+      <w:r>
+        <w:t>Preço Previsto: 446.89</w:t>
+      </w:r>
+    </w:p>
+    <w:p>
+      <w:r>
+        <w:t>Loja: TOPSHITECH</w:t>
+      </w:r>
+    </w:p>
+    <w:p>
+      <w:r>
+        <w:t>Tipo: Clássico</w:t>
+      </w:r>
+    </w:p>
+    <w:p>
+      <w:r>
+        <w:t>Lugar: São Paulo, São Paulo.</w:t>
+      </w:r>
+    </w:p>
+    <w:p>
+      <w:r>
+        <w:t>--------------------------------------------------------------------</w:t>
+      </w:r>
+    </w:p>
+    <w:p/>
+    <w:p>
+      <w:r>
+        <w:t>Modelo: FONTE 120 BOB</w:t>
+      </w:r>
+    </w:p>
+    <w:p>
+      <w:r>
+        <w:t>URL: https://www.shoppratico.com.br/MLB-3348316634-fonte-carregador-automotivo-jfa-bob-storm-120a-bivolt-_JM#position%3D3%26search_layout%3Dstack%26type%3Ditem%26tracking_id%3Deaeaf62b-93d9-491e-a369-dda72e3f48fd</w:t>
+      </w:r>
+    </w:p>
+    <w:p>
+      <w:r>
+        <w:t>Nome: fonte carregador automotivo jfa bob storm 120a bivolt</w:t>
+      </w:r>
+    </w:p>
+    <w:p>
+      <w:r>
+        <w:t>Preço: 419.85</w:t>
+      </w:r>
+    </w:p>
+    <w:p>
+      <w:r>
+        <w:t>Preço Previsto: 419.86</w:t>
+      </w:r>
+    </w:p>
+    <w:p>
+      <w:r>
+        <w:t>Loja: SHOPPRATICO</w:t>
+      </w:r>
+    </w:p>
+    <w:p>
+      <w:r>
+        <w:t xml:space="preserve">Tipo: </w:t>
+      </w:r>
+    </w:p>
+    <w:p>
+      <w:r>
+        <w:t>Lugar: Sorocaba, São Paulo.</w:t>
+      </w:r>
+    </w:p>
+    <w:p>
+      <w:r>
+        <w:t>--------------------------------------------------------------------</w:t>
+      </w:r>
+    </w:p>
+    <w:p/>
+    <w:p>
+      <w:r>
+        <w:t>Modelo: FONTE 120 BOB</w:t>
+      </w:r>
+    </w:p>
+    <w:p>
+      <w:r>
+        <w:t>URL: https://www.radicalsom.com.br/MLB-2743177769-fonte-carregador-jfa-120a-bob-slim-bivolt-_JM#position%3D1%26search_layout%3Dstack%26type%3Ditem%26tracking_id%3Dbfdb530a-acd2-4df2-ab10-1fd211237e11</w:t>
+      </w:r>
+    </w:p>
+    <w:p>
+      <w:r>
+        <w:t>Nome: fonte carregador jfa 120a bob slim bivolt</w:t>
+      </w:r>
+    </w:p>
+    <w:p>
+      <w:r>
+        <w:t>Preço: 419.85</w:t>
+      </w:r>
+    </w:p>
+    <w:p>
+      <w:r>
+        <w:t>Preço Previsto: 419.86</w:t>
+      </w:r>
+    </w:p>
+    <w:p>
+      <w:r>
+        <w:t>Loja: RADICALSOM</w:t>
+      </w:r>
+    </w:p>
+    <w:p>
+      <w:r>
+        <w:t xml:space="preserve">Tipo: </w:t>
+      </w:r>
+    </w:p>
+    <w:p>
+      <w:r>
+        <w:t>Lugar: Artur nogueira, São Paulo.</w:t>
+      </w:r>
+    </w:p>
+    <w:p>
+      <w:r>
+        <w:t>--------------------------------------------------------------------</w:t>
+      </w:r>
+    </w:p>
+    <w:p/>
+    <w:p>
+      <w:r>
+        <w:t>Modelo: FONTE 120 BOB</w:t>
+      </w:r>
+    </w:p>
+    <w:p>
+      <w:r>
+        <w:t>URL: https://produto.mercadolivre.com.br/MLB-3240204497-fonte-carregador-jfa-120a-bob-storm-slim-bivolt-_JM</w:t>
+      </w:r>
+    </w:p>
+    <w:p>
+      <w:r>
+        <w:t xml:space="preserve">Nome: Fonte Carregador Jfa 120a Bob Storm Slim Bivolt </w:t>
+      </w:r>
+    </w:p>
+    <w:p>
+      <w:r>
+        <w:t>Preço: 446.88</w:t>
+      </w:r>
+    </w:p>
+    <w:p>
+      <w:r>
+        <w:t>Preço Previsto: 446.89</w:t>
+      </w:r>
+    </w:p>
+    <w:p>
+      <w:r>
+        <w:t>Loja: CK SOUND</w:t>
+      </w:r>
+    </w:p>
+    <w:p>
+      <w:r>
+        <w:t>Tipo: Clássico</w:t>
+      </w:r>
+    </w:p>
+    <w:p>
+      <w:r>
+        <w:t>Lugar: Campinas, São Paulo.</w:t>
+      </w:r>
+    </w:p>
+    <w:p>
+      <w:r>
+        <w:t>--------------------------------------------------------------------</w:t>
+      </w:r>
+    </w:p>
+    <w:p/>
+    <w:p>
+      <w:r>
+        <w:t>Modelo: FONTE 120 BOB</w:t>
+      </w:r>
+    </w:p>
+    <w:p>
+      <w:r>
+        <w:t>URL: https://produto.mercadolivre.com.br/MLB-3184754825-fonte-carregador-automotivo-jfa-bob-storm-120a-bivolt-_JM</w:t>
       </w:r>
     </w:p>
     <w:p>
@@ -19,12 +341,242 @@
     </w:p>
     <w:p>
       <w:r>
-        <w:t>Preço: 499.45</w:t>
+        <w:t>Preço: 446.88</w:t>
       </w:r>
     </w:p>
     <w:p>
       <w:r>
-        <w:t>Preço Previsto: 499.46</w:t>
+        <w:t>Preço Previsto: 446.89</w:t>
+      </w:r>
+    </w:p>
+    <w:p>
+      <w:r>
+        <w:t>Loja: YTRIUM SHOP</w:t>
+      </w:r>
+    </w:p>
+    <w:p>
+      <w:r>
+        <w:t>Tipo: Clássico</w:t>
+      </w:r>
+    </w:p>
+    <w:p>
+      <w:r>
+        <w:t>Lugar: João Pessoa, Paraíba.</w:t>
+      </w:r>
+    </w:p>
+    <w:p>
+      <w:r>
+        <w:t>--------------------------------------------------------------------</w:t>
+      </w:r>
+    </w:p>
+    <w:p/>
+    <w:p>
+      <w:r>
+        <w:t>Modelo: FONTE 120 BOB</w:t>
+      </w:r>
+    </w:p>
+    <w:p>
+      <w:r>
+        <w:t>URL: https://produto.mercadolivre.com.br/MLB-4411690986-fonte-carregador-bateria-bivolt-bob-storm-120a-digital-jfa-_JM</w:t>
+      </w:r>
+    </w:p>
+    <w:p>
+      <w:r>
+        <w:t>Nome: Fonte Carregador Bateria Bivolt Bob Storm 120a Digital Jfa</w:t>
+      </w:r>
+    </w:p>
+    <w:p>
+      <w:r>
+        <w:t>Preço: 482.92</w:t>
+      </w:r>
+    </w:p>
+    <w:p>
+      <w:r>
+        <w:t>Preço Previsto: 482.93</w:t>
+      </w:r>
+    </w:p>
+    <w:p>
+      <w:r>
+        <w:t>Loja: KOALAPARTS</w:t>
+      </w:r>
+    </w:p>
+    <w:p>
+      <w:r>
+        <w:t>Tipo: Premium</w:t>
+      </w:r>
+    </w:p>
+    <w:p>
+      <w:r>
+        <w:t>Lugar: Bragança Paulista, São Paulo.</w:t>
+      </w:r>
+    </w:p>
+    <w:p>
+      <w:r>
+        <w:t>--------------------------------------------------------------------</w:t>
+      </w:r>
+    </w:p>
+    <w:p/>
+    <w:p>
+      <w:r>
+        <w:t>Modelo: FONTE 120 BOB</w:t>
+      </w:r>
+    </w:p>
+    <w:p>
+      <w:r>
+        <w:t>URL: https://produto.mercadolivre.com.br/MLB-3279321391-fonte-carregador-jfa-120a-bob-storm-bivolt-automatico-_JM</w:t>
+      </w:r>
+    </w:p>
+    <w:p>
+      <w:r>
+        <w:t>Nome: Fonte Carregador Jfa 120a Bob Storm Bivolt Automático</w:t>
+      </w:r>
+    </w:p>
+    <w:p>
+      <w:r>
+        <w:t>Preço: 446.88</w:t>
+      </w:r>
+    </w:p>
+    <w:p>
+      <w:r>
+        <w:t>Preço Previsto: 446.89</w:t>
+      </w:r>
+    </w:p>
+    <w:p>
+      <w:r>
+        <w:t>Loja: BETACARSS</w:t>
+      </w:r>
+    </w:p>
+    <w:p>
+      <w:r>
+        <w:t>Tipo: Clássico</w:t>
+      </w:r>
+    </w:p>
+    <w:p>
+      <w:r>
+        <w:t>Lugar: Aparecida de Goiânia, Goiás.</w:t>
+      </w:r>
+    </w:p>
+    <w:p>
+      <w:r>
+        <w:t>--------------------------------------------------------------------</w:t>
+      </w:r>
+    </w:p>
+    <w:p/>
+    <w:p>
+      <w:r>
+        <w:t>Modelo: FONTE 120 BOB</w:t>
+      </w:r>
+    </w:p>
+    <w:p>
+      <w:r>
+        <w:t>URL: https://produto.mercadolivre.com.br/MLB-3707091336-carregador-fonte-automotivo-120a-jfa-storm-bob-_JM</w:t>
+      </w:r>
+    </w:p>
+    <w:p>
+      <w:r>
+        <w:t>Nome: Carregador Fonte Automotivo 120a Jfa Storm Bob</w:t>
+      </w:r>
+    </w:p>
+    <w:p>
+      <w:r>
+        <w:t>Preço: 446.88</w:t>
+      </w:r>
+    </w:p>
+    <w:p>
+      <w:r>
+        <w:t>Preço Previsto: 446.89</w:t>
+      </w:r>
+    </w:p>
+    <w:p>
+      <w:r>
+        <w:t>Loja: DIGITALSHOP SC</w:t>
+      </w:r>
+    </w:p>
+    <w:p>
+      <w:r>
+        <w:t>Tipo: Clássico</w:t>
+      </w:r>
+    </w:p>
+    <w:p>
+      <w:r>
+        <w:t>Lugar: Penha, Santa Catarina.</w:t>
+      </w:r>
+    </w:p>
+    <w:p>
+      <w:r>
+        <w:t>--------------------------------------------------------------------</w:t>
+      </w:r>
+    </w:p>
+    <w:p/>
+    <w:p>
+      <w:r>
+        <w:t>Modelo: FONTE 120 BOB</w:t>
+      </w:r>
+    </w:p>
+    <w:p>
+      <w:r>
+        <w:t>URL: https://produto.mercadolivre.com.br/MLB-2794608260-fonte-e-carregador-de-bateria-jfa-120a-bob-storm-slim-bivolt-_JM</w:t>
+      </w:r>
+    </w:p>
+    <w:p>
+      <w:r>
+        <w:t>Nome: Fonte E Carregador De Bateria Jfa 120a Bob Storm Slim Bivolt</w:t>
+      </w:r>
+    </w:p>
+    <w:p>
+      <w:r>
+        <w:t>Preço: 446.88</w:t>
+      </w:r>
+    </w:p>
+    <w:p>
+      <w:r>
+        <w:t>Preço Previsto: 446.89</w:t>
+      </w:r>
+    </w:p>
+    <w:p>
+      <w:r>
+        <w:t>Loja: RENOV VENDAS_ONLINE</w:t>
+      </w:r>
+    </w:p>
+    <w:p>
+      <w:r>
+        <w:t>Tipo: Clássico</w:t>
+      </w:r>
+    </w:p>
+    <w:p>
+      <w:r>
+        <w:t>Lugar: São João da Boa Vista, São Paulo.</w:t>
+      </w:r>
+    </w:p>
+    <w:p>
+      <w:r>
+        <w:t>--------------------------------------------------------------------</w:t>
+      </w:r>
+    </w:p>
+    <w:p/>
+    <w:p>
+      <w:r>
+        <w:t>Modelo: FONTE 120 BOB</w:t>
+      </w:r>
+    </w:p>
+    <w:p>
+      <w:r>
+        <w:t>URL: https://produto.mercadolivre.com.br/MLB-2915788930-fonte-carregador-automotivo-jfa-bob-storm-120a-bivolt-_JM</w:t>
+      </w:r>
+    </w:p>
+    <w:p>
+      <w:r>
+        <w:t>Nome: Fonte Carregador Automotivo Jfa Bob Storm 120a Bivolt</w:t>
+      </w:r>
+    </w:p>
+    <w:p>
+      <w:r>
+        <w:t>Preço: 446.88</w:t>
+      </w:r>
+    </w:p>
+    <w:p>
+      <w:r>
+        <w:t>Preço Previsto: 446.89</w:t>
       </w:r>
     </w:p>
     <w:p>
@@ -55,37 +607,37 @@
     </w:p>
     <w:p>
       <w:r>
-        <w:t>URL: https://produto.mercadolivre.com.br/MLB-4758229736-fonte-bob-storm-120a-jfa-_JM</w:t>
+        <w:t>URL: https://produto.mercadolivre.com.br/MLB-3729240651-fonte-carregador-jfa-120a-bob-slim-bivolt-cor-preto-_JM</w:t>
       </w:r>
     </w:p>
     <w:p>
       <w:r>
-        <w:t>Nome: Fonte Bob Storm 120a - Jfa</w:t>
+        <w:t>Nome: Fonte Carregador Jfa 120a Bob Slim Bivolt Cor Preto</w:t>
       </w:r>
     </w:p>
     <w:p>
       <w:r>
-        <w:t>Preço: 500.0</w:t>
+        <w:t>Preço: 446.88</w:t>
       </w:r>
     </w:p>
     <w:p>
       <w:r>
-        <w:t>Preço Previsto: 539.74</w:t>
+        <w:t>Preço Previsto: 446.89</w:t>
       </w:r>
     </w:p>
     <w:p>
       <w:r>
-        <w:t>Loja: ULTRA COMERCE</w:t>
+        <w:t>Loja: KOALAPARTS_SP</w:t>
       </w:r>
     </w:p>
     <w:p>
       <w:r>
-        <w:t>Tipo: Premium</w:t>
+        <w:t>Tipo: Clássico</w:t>
       </w:r>
     </w:p>
     <w:p>
       <w:r>
-        <w:t>Lugar: Braço do Norte, Santa Catarina.</w:t>
+        <w:t>Lugar: Bragança Paulista, São Paulo.</w:t>
       </w:r>
     </w:p>
     <w:p>
@@ -101,37 +653,37 @@
     </w:p>
     <w:p>
       <w:r>
-        <w:t>URL: https://produto.mercadolivre.com.br/MLB-3208645605-fonte-automotiva-jfa-bob-storm-120a-bivolt-carregador-_JM</w:t>
+        <w:t>URL: https://produto.mercadolivre.com.br/MLB-3640270825-fonte-carregador-de-baterias-jfa-120a-bob-storm-slim-bivolt-_JM</w:t>
       </w:r>
     </w:p>
     <w:p>
       <w:r>
-        <w:t>Nome: Fonte Automotiva Jfa Bob Storm 120a Bivolt Carregador</w:t>
+        <w:t>Nome: Fonte Carregador De Baterias Jfa 120a Bob Storm Slim Bivolt</w:t>
       </w:r>
     </w:p>
     <w:p>
       <w:r>
-        <w:t>Preço: 539.34</w:t>
+        <w:t>Preço: 446.88</w:t>
       </w:r>
     </w:p>
     <w:p>
       <w:r>
-        <w:t>Preço Previsto: 539.74</w:t>
+        <w:t>Preço Previsto: 446.89</w:t>
       </w:r>
     </w:p>
     <w:p>
       <w:r>
-        <w:t>Loja: TAMANDARÉ SHOP</w:t>
+        <w:t>Loja: BASSANPARTS</w:t>
       </w:r>
     </w:p>
     <w:p>
       <w:r>
-        <w:t>Tipo: Premium</w:t>
+        <w:t>Tipo: Clássico</w:t>
       </w:r>
     </w:p>
     <w:p>
       <w:r>
-        <w:t>Lugar: Ribeirão Preto, São Paulo.</w:t>
+        <w:t>Lugar: Penha, Santa Catarina.</w:t>
       </w:r>
     </w:p>
     <w:p>

</xml_diff>